<commit_message>
Colocar ESTRATEK S.A.S. SUCURSAL DEL PERU como proveedor en la justificacion de OC
Co-Authored-By: Claude Opus 5.5 <noreply@anthropic.com>
Claude-Session: https://claude.ai/code/session_01DoHx9ZQNZXcgog7oJGoyRL
</commit_message>
<xml_diff>
--- a/JUSTIFICACION_OC_INSERCION_VEHICULAR.docx
+++ b/JUSTIFICACION_OC_INSERCION_VEHICULAR.docx
@@ -157,17 +157,18 @@
       <w:r>
         <w:rPr>
           <w:rFonts w:ascii="Times New Roman" w:eastAsia="Times New Roman" w:hAnsi="Times New Roman" w:cs="Times New Roman"/>
-          <w:color w:val="000000" w:themeColor="text1"/>
-          <w:highlight w:val="yellow"/>
-        </w:rPr>
-        <w:t xml:space="preserve">[RAZÓN SOCIAL DEL PROVEEDOR]</w:t>
-      </w:r>
-      <w:r>
-        <w:rPr>
-          <w:rFonts w:ascii="Times New Roman" w:eastAsia="Times New Roman" w:hAnsi="Times New Roman" w:cs="Times New Roman"/>
-          <w:color w:val="000000" w:themeColor="text1"/>
-        </w:rPr>
-        <w:t xml:space="preserve"> brinda la plataforma de registros de la iniciativa y cobra por registro efectivo (US$ 0.80 por registro), por lo que el gasto es proporcional a los resultados obtenidos. Además, permite ampliar la meta en bloques de 10,000 registros sin cambiar las condiciones del servicio.</w:t>
+          <w:b/>
+          <w:bCs/>
+          <w:color w:val="000000" w:themeColor="text1"/>
+        </w:rPr>
+        <w:t xml:space="preserve">ESTRATEK S.A.S. SUCURSAL DEL PERU</w:t>
+      </w:r>
+      <w:r>
+        <w:rPr>
+          <w:rFonts w:ascii="Times New Roman" w:eastAsia="Times New Roman" w:hAnsi="Times New Roman" w:cs="Times New Roman"/>
+          <w:color w:val="000000" w:themeColor="text1"/>
+        </w:rPr>
+        <w:t xml:space="preserve"> ya trabaja con Cálidda como proveedor de soluciones y servicios especializados (figura en el listado de destinatarios de datos personales de Cálidda) y brinda la plataforma de registros de la iniciativa y cobra por registro efectivo (US$ 0.80 por registro), por lo que el gasto es proporcional a los resultados obtenidos. Además, permite ampliar la meta en bloques de 10,000 registros sin cambiar las condiciones del servicio.</w:t>
       </w:r>
     </w:p>
     <w:p>
@@ -699,12 +700,13 @@
       <w:r>
         <w:rPr>
           <w:rFonts w:ascii="Times New Roman" w:eastAsia="Times New Roman" w:hAnsi="Times New Roman" w:cs="Times New Roman"/>
-          <w:i/>
-          <w:iCs/>
-          <w:color w:val="000000" w:themeColor="text1"/>
-          <w:highlight w:val="yellow"/>
-        </w:rPr>
-        <w:t xml:space="preserve">[RAZÓN SOCIAL DEL PROVEEDOR]</w:t>
+          <w:b/>
+          <w:bCs/>
+          <w:i/>
+          <w:iCs/>
+          <w:color w:val="000000" w:themeColor="text1"/>
+        </w:rPr>
+        <w:t xml:space="preserve">ESTRATEK S.A.S. SUCURSAL DEL PERU</w:t>
       </w:r>
       <w:r>
         <w:rPr>

</xml_diff>

<commit_message>
Reformular justificacion como ampliacion de OC de S/ 27,000 con Estratek
Co-Authored-By: Claude Opus 5.5 <noreply@anthropic.com>
Claude-Session: https://claude.ai/code/session_01DoHx9ZQNZXcgog7oJGoyRL
</commit_message>
<xml_diff>
--- a/JUSTIFICACION_OC_INSERCION_VEHICULAR.docx
+++ b/JUSTIFICACION_OC_INSERCION_VEHICULAR.docx
@@ -50,6 +50,46 @@
           <w:iCs/>
           <w:color w:val="000000" w:themeColor="text1"/>
         </w:rPr>
+        <w:t xml:space="preserve">TIPO DE SOLICITUD: </w:t>
+      </w:r>
+      <w:r>
+        <w:rPr>
+          <w:rFonts w:ascii="Times New Roman" w:eastAsia="Times New Roman" w:hAnsi="Times New Roman" w:cs="Times New Roman"/>
+          <w:i/>
+          <w:iCs/>
+          <w:color w:val="000000" w:themeColor="text1"/>
+        </w:rPr>
+        <w:t xml:space="preserve">Ampliación de monto de Orden de Compra N° </w:t>
+      </w:r>
+      <w:r>
+        <w:rPr>
+          <w:rFonts w:ascii="Times New Roman" w:eastAsia="Times New Roman" w:hAnsi="Times New Roman" w:cs="Times New Roman"/>
+          <w:i/>
+          <w:iCs/>
+          <w:color w:val="000000" w:themeColor="text1"/>
+          <w:highlight w:val="yellow"/>
+        </w:rPr>
+        <w:t xml:space="preserve">[N° OC VIGENTE]</w:t>
+      </w:r>
+    </w:p>
+    <w:p>
+      <w:pPr>
+        <w:spacing w:before="100" w:after="240" w:line="240" w:lineRule="auto"/>
+        <w:ind w:left="3540"/>
+        <w:rPr>
+          <w:rFonts w:ascii="Times New Roman" w:eastAsia="Times New Roman" w:hAnsi="Times New Roman" w:cs="Times New Roman"/>
+          <w:color w:val="000000" w:themeColor="text1"/>
+        </w:rPr>
+      </w:pPr>
+      <w:r>
+        <w:rPr>
+          <w:rFonts w:ascii="Times New Roman" w:eastAsia="Times New Roman" w:hAnsi="Times New Roman" w:cs="Times New Roman"/>
+          <w:b/>
+          <w:bCs/>
+          <w:i/>
+          <w:iCs/>
+          <w:color w:val="000000" w:themeColor="text1"/>
+        </w:rPr>
         <w:t xml:space="preserve">MODALIDAD SELECCIÓN: </w:t>
       </w:r>
       <w:r>
@@ -97,24 +137,40 @@
           <w:rFonts w:ascii="Times New Roman" w:eastAsia="Times New Roman" w:hAnsi="Times New Roman" w:cs="Times New Roman"/>
           <w:color w:val="000000" w:themeColor="text1"/>
         </w:rPr>
-        <w:t xml:space="preserve">Se requiere contratar los servicios necesarios para ejecutar la iniciativa de inserción vehicular de Cálidda durante los próximos dos meses y medio (75 días), cuyo objetivo es captar y registrar hasta 10,000 conductores. El presupuesto cubre los tres gastos prioritarios de la iniciativa: (1) la plataforma de registros, (2) el marketing digital para generar registros y (3) el volanteo en campo.</w:t>
-      </w:r>
-    </w:p>
-    <w:p>
-      <w:pPr>
-        <w:spacing w:before="100" w:after="240" w:line="240" w:lineRule="auto"/>
-        <w:ind w:left="3540"/>
-        <w:rPr>
-          <w:rFonts w:ascii="Times New Roman" w:eastAsia="Times New Roman" w:hAnsi="Times New Roman" w:cs="Times New Roman"/>
-          <w:color w:val="000000" w:themeColor="text1"/>
-        </w:rPr>
-      </w:pPr>
-      <w:r>
-        <w:rPr>
-          <w:rFonts w:ascii="Times New Roman" w:eastAsia="Times New Roman" w:hAnsi="Times New Roman" w:cs="Times New Roman"/>
-          <w:color w:val="000000" w:themeColor="text1"/>
-        </w:rPr>
-        <w:t xml:space="preserve">El monto se calculó para el escenario de 10,000 registros, de modo que la orden de compra cubra la ejecución completa de la iniciativa. Este monto es un tope: el gasto real dependerá de los registros que se obtengan en el periodo.</w:t>
+        <w:t xml:space="preserve">Se solicita la ampliación del monto de la orden de compra vigente con </w:t>
+      </w:r>
+      <w:r>
+        <w:rPr>
+          <w:rFonts w:ascii="Times New Roman" w:eastAsia="Times New Roman" w:hAnsi="Times New Roman" w:cs="Times New Roman"/>
+          <w:b/>
+          <w:bCs/>
+          <w:color w:val="000000" w:themeColor="text1"/>
+        </w:rPr>
+        <w:t xml:space="preserve">ESTRATEK S.A.S. SUCURSAL DEL PERU</w:t>
+      </w:r>
+      <w:r>
+        <w:rPr>
+          <w:rFonts w:ascii="Times New Roman" w:eastAsia="Times New Roman" w:hAnsi="Times New Roman" w:cs="Times New Roman"/>
+          <w:color w:val="000000" w:themeColor="text1"/>
+        </w:rPr>
+        <w:t xml:space="preserve"> por S/ 27,000.00 + IGV, para cubrir el servicio integral de gestión y ejecución de la iniciativa de inserción vehicular de Cálidda durante los próximos dos meses y medio (75 días).</w:t>
+      </w:r>
+    </w:p>
+    <w:p>
+      <w:pPr>
+        <w:spacing w:before="100" w:after="240" w:line="240" w:lineRule="auto"/>
+        <w:ind w:left="3540"/>
+        <w:rPr>
+          <w:rFonts w:ascii="Times New Roman" w:eastAsia="Times New Roman" w:hAnsi="Times New Roman" w:cs="Times New Roman"/>
+          <w:color w:val="000000" w:themeColor="text1"/>
+        </w:rPr>
+      </w:pPr>
+      <w:r>
+        <w:rPr>
+          <w:rFonts w:ascii="Times New Roman" w:eastAsia="Times New Roman" w:hAnsi="Times New Roman" w:cs="Times New Roman"/>
+          <w:color w:val="000000" w:themeColor="text1"/>
+        </w:rPr>
+        <w:t xml:space="preserve">La iniciativa tiene como objetivo captar y registrar 5,000 conductores, y comprende tres componentes: (1) plataforma de registros y chatbot de atención, (2) volanteo en campo y (3) marketing digital para la captación de registros. El monto solicitado es un tope: el gasto se ejecutará en función de los registros efectivamente obtenidos.</w:t>
       </w:r>
     </w:p>
     <w:p>
@@ -168,28 +224,28 @@
           <w:rFonts w:ascii="Times New Roman" w:eastAsia="Times New Roman" w:hAnsi="Times New Roman" w:cs="Times New Roman"/>
           <w:color w:val="000000" w:themeColor="text1"/>
         </w:rPr>
-        <w:t xml:space="preserve"> ya trabaja con Cálidda como proveedor de soluciones y servicios especializados (figura en el listado de destinatarios de datos personales de Cálidda) y brinda la plataforma de registros de la iniciativa y cobra por registro efectivo (US$ 0.80 por registro), por lo que el gasto es proporcional a los resultados obtenidos. Además, permite ampliar la meta en bloques de 10,000 registros sin cambiar las condiciones del servicio.</w:t>
-      </w:r>
-    </w:p>
-    <w:p>
-      <w:pPr>
-        <w:spacing w:before="100" w:after="240" w:line="240" w:lineRule="auto"/>
-        <w:ind w:left="3540"/>
-        <w:rPr>
-          <w:rFonts w:ascii="Times New Roman" w:eastAsia="Times New Roman" w:hAnsi="Times New Roman" w:cs="Times New Roman"/>
-          <w:color w:val="000000" w:themeColor="text1"/>
-        </w:rPr>
-      </w:pPr>
-      <w:r>
-        <w:rPr>
-          <w:rFonts w:ascii="Times New Roman" w:eastAsia="Times New Roman" w:hAnsi="Times New Roman" w:cs="Times New Roman"/>
-          <w:b/>
-          <w:bCs/>
-          <w:i/>
-          <w:iCs/>
-          <w:color w:val="000000" w:themeColor="text1"/>
-        </w:rPr>
-        <w:t xml:space="preserve">DETALLE DE GASTOS (escenario 10,000 registros – 2.5 meses):</w:t>
+        <w:t xml:space="preserve"> cuenta con una orden de compra vigente con Cálidda y es el responsable de la ejecución integral de la iniciativa. Gestiona y coordina, a través de aliados especializados, los tres componentes del servicio, de modo que Cálidda cuenta con una sola contraparte, una sola facturación y un único responsable del cumplimiento. Ampliar la orden vigente da continuidad a la iniciativa sin interrumpir la operación en curso.</w:t>
+      </w:r>
+    </w:p>
+    <w:p>
+      <w:pPr>
+        <w:spacing w:before="100" w:after="240" w:line="240" w:lineRule="auto"/>
+        <w:ind w:left="3540"/>
+        <w:rPr>
+          <w:rFonts w:ascii="Times New Roman" w:eastAsia="Times New Roman" w:hAnsi="Times New Roman" w:cs="Times New Roman"/>
+          <w:color w:val="000000" w:themeColor="text1"/>
+        </w:rPr>
+      </w:pPr>
+      <w:r>
+        <w:rPr>
+          <w:rFonts w:ascii="Times New Roman" w:eastAsia="Times New Roman" w:hAnsi="Times New Roman" w:cs="Times New Roman"/>
+          <w:b/>
+          <w:bCs/>
+          <w:i/>
+          <w:iCs/>
+          <w:color w:val="000000" w:themeColor="text1"/>
+        </w:rPr>
+        <w:t xml:space="preserve">DETALLE DE GASTOS (75 días):</w:t>
       </w:r>
     </w:p>
     <w:p>
@@ -210,16 +266,16 @@
           <w:iCs/>
           <w:color w:val="000000" w:themeColor="text1"/>
         </w:rPr>
-        <w:t xml:space="preserve">1. Plataforma de registros: </w:t>
-      </w:r>
-      <w:r>
-        <w:rPr>
-          <w:rFonts w:ascii="Times New Roman" w:eastAsia="Times New Roman" w:hAnsi="Times New Roman" w:cs="Times New Roman"/>
-          <w:i/>
-          <w:iCs/>
-          <w:color w:val="000000" w:themeColor="text1"/>
-        </w:rPr>
-        <w:t xml:space="preserve">10,000 registros × US$ 0.80 = US$ 8,000.00</w:t>
+        <w:t xml:space="preserve">1. Plataforma de registros y chatbot: </w:t>
+      </w:r>
+      <w:r>
+        <w:rPr>
+          <w:rFonts w:ascii="Times New Roman" w:eastAsia="Times New Roman" w:hAnsi="Times New Roman" w:cs="Times New Roman"/>
+          <w:i/>
+          <w:iCs/>
+          <w:color w:val="000000" w:themeColor="text1"/>
+        </w:rPr>
+        <w:t xml:space="preserve">5,000 registros × US$ 0.80 por registro (incluye las conversaciones del chatbot con el conductor) = US$ 4,000.00 ≈ S/ 13,600.00</w:t>
       </w:r>
     </w:p>
     <w:p>
@@ -240,16 +296,16 @@
           <w:iCs/>
           <w:color w:val="000000" w:themeColor="text1"/>
         </w:rPr>
-        <w:t xml:space="preserve">2. Marketing digital: </w:t>
-      </w:r>
-      <w:r>
-        <w:rPr>
-          <w:rFonts w:ascii="Times New Roman" w:eastAsia="Times New Roman" w:hAnsi="Times New Roman" w:cs="Times New Roman"/>
-          <w:i/>
-          <w:iCs/>
-          <w:color w:val="000000" w:themeColor="text1"/>
-        </w:rPr>
-        <w:t xml:space="preserve">10,000 registros × US$ 0.50 = US$ 5,000.00 (presupuesto para ampliar la bolsa de recursos de captación de registros)</w:t>
+        <w:t xml:space="preserve">2. Volanteo en campo: </w:t>
+      </w:r>
+      <w:r>
+        <w:rPr>
+          <w:rFonts w:ascii="Times New Roman" w:eastAsia="Times New Roman" w:hAnsi="Times New Roman" w:cs="Times New Roman"/>
+          <w:i/>
+          <w:iCs/>
+          <w:color w:val="000000" w:themeColor="text1"/>
+        </w:rPr>
+        <w:t xml:space="preserve">S/ 150 por día × 26 días al mes × 2.5 meses = S/ 9,750.00</w:t>
       </w:r>
     </w:p>
     <w:p>
@@ -270,67 +326,67 @@
           <w:iCs/>
           <w:color w:val="000000" w:themeColor="text1"/>
         </w:rPr>
-        <w:t xml:space="preserve">3. Volanteo: </w:t>
-      </w:r>
-      <w:r>
-        <w:rPr>
-          <w:rFonts w:ascii="Times New Roman" w:eastAsia="Times New Roman" w:hAnsi="Times New Roman" w:cs="Times New Roman"/>
-          <w:i/>
-          <w:iCs/>
-          <w:color w:val="000000" w:themeColor="text1"/>
-        </w:rPr>
-        <w:t xml:space="preserve">S/ 150 por día × 26 días al mes × 2.5 meses = S/ 9,750.00 ≈ US$ 2,867.65 (T.C. 3.40; pago del servicio del equipo de campo)</w:t>
-      </w:r>
-    </w:p>
-    <w:p>
-      <w:pPr>
-        <w:spacing w:before="100" w:after="240" w:line="240" w:lineRule="auto"/>
-        <w:ind w:left="3540"/>
-        <w:rPr>
-          <w:rFonts w:ascii="Times New Roman" w:eastAsia="Times New Roman" w:hAnsi="Times New Roman" w:cs="Times New Roman"/>
-          <w:color w:val="000000" w:themeColor="text1"/>
-        </w:rPr>
-      </w:pPr>
-      <w:r>
-        <w:rPr>
-          <w:rFonts w:ascii="Times New Roman" w:eastAsia="Times New Roman" w:hAnsi="Times New Roman" w:cs="Times New Roman"/>
-          <w:i/>
-          <w:iCs/>
-          <w:color w:val="000000" w:themeColor="text1"/>
-        </w:rPr>
-        <w:t xml:space="preserve">Detalle completo y escenario alternativo de 5,000 registros (US$ 9,367.65 + IGV) en el Excel adjunto “detalle-gastos-insercion-vehicular.xlsx”.</w:t>
-      </w:r>
-    </w:p>
-    <w:p>
-      <w:pPr>
-        <w:spacing w:before="100" w:after="240" w:line="240" w:lineRule="auto"/>
-        <w:ind w:left="3540"/>
-        <w:rPr>
-          <w:rFonts w:ascii="Times New Roman" w:eastAsia="Times New Roman" w:hAnsi="Times New Roman" w:cs="Times New Roman"/>
-          <w:color w:val="000000" w:themeColor="text1"/>
-        </w:rPr>
-      </w:pPr>
-      <w:r>
-        <w:rPr>
-          <w:rFonts w:ascii="Times New Roman" w:eastAsia="Times New Roman" w:hAnsi="Times New Roman" w:cs="Times New Roman"/>
-          <w:b/>
-          <w:bCs/>
-          <w:i/>
-          <w:iCs/>
-          <w:color w:val="000000" w:themeColor="text1"/>
-        </w:rPr>
-        <w:t xml:space="preserve">MONTO TOTAL: </w:t>
-      </w:r>
-      <w:r>
-        <w:rPr>
-          <w:rFonts w:ascii="Times New Roman" w:eastAsia="Times New Roman" w:hAnsi="Times New Roman" w:cs="Times New Roman"/>
-          <w:b/>
-          <w:bCs/>
-          <w:i/>
-          <w:iCs/>
-          <w:color w:val="000000" w:themeColor="text1"/>
-        </w:rPr>
-        <w:t xml:space="preserve">US$ 15,867.65 + IGV</w:t>
+        <w:t xml:space="preserve">3. Marketing digital: </w:t>
+      </w:r>
+      <w:r>
+        <w:rPr>
+          <w:rFonts w:ascii="Times New Roman" w:eastAsia="Times New Roman" w:hAnsi="Times New Roman" w:cs="Times New Roman"/>
+          <w:i/>
+          <w:iCs/>
+          <w:color w:val="000000" w:themeColor="text1"/>
+        </w:rPr>
+        <w:t xml:space="preserve">campañas digitales para la captación de registros = S/ 3,650.00</w:t>
+      </w:r>
+    </w:p>
+    <w:p>
+      <w:pPr>
+        <w:spacing w:before="100" w:after="240" w:line="240" w:lineRule="auto"/>
+        <w:ind w:left="3540"/>
+        <w:rPr>
+          <w:rFonts w:ascii="Times New Roman" w:eastAsia="Times New Roman" w:hAnsi="Times New Roman" w:cs="Times New Roman"/>
+          <w:color w:val="000000" w:themeColor="text1"/>
+        </w:rPr>
+      </w:pPr>
+      <w:r>
+        <w:rPr>
+          <w:rFonts w:ascii="Times New Roman" w:eastAsia="Times New Roman" w:hAnsi="Times New Roman" w:cs="Times New Roman"/>
+          <w:i/>
+          <w:iCs/>
+          <w:color w:val="000000" w:themeColor="text1"/>
+        </w:rPr>
+        <w:t xml:space="preserve">Tipo de cambio referencial: S/ 3.40 por US$. El detalle completo se adjunta en el Excel “detalle-gastos-insercion-vehicular.xlsx”.</w:t>
+      </w:r>
+    </w:p>
+    <w:p>
+      <w:pPr>
+        <w:spacing w:before="100" w:after="240" w:line="240" w:lineRule="auto"/>
+        <w:ind w:left="3540"/>
+        <w:rPr>
+          <w:rFonts w:ascii="Times New Roman" w:eastAsia="Times New Roman" w:hAnsi="Times New Roman" w:cs="Times New Roman"/>
+          <w:color w:val="000000" w:themeColor="text1"/>
+        </w:rPr>
+      </w:pPr>
+      <w:r>
+        <w:rPr>
+          <w:rFonts w:ascii="Times New Roman" w:eastAsia="Times New Roman" w:hAnsi="Times New Roman" w:cs="Times New Roman"/>
+          <w:b/>
+          <w:bCs/>
+          <w:i/>
+          <w:iCs/>
+          <w:color w:val="000000" w:themeColor="text1"/>
+        </w:rPr>
+        <w:t xml:space="preserve">MONTO TOTAL DE LA AMPLIACIÓN: </w:t>
+      </w:r>
+      <w:r>
+        <w:rPr>
+          <w:rFonts w:ascii="Times New Roman" w:eastAsia="Times New Roman" w:hAnsi="Times New Roman" w:cs="Times New Roman"/>
+          <w:b/>
+          <w:bCs/>
+          <w:i/>
+          <w:iCs/>
+          <w:color w:val="000000" w:themeColor="text1"/>
+        </w:rPr>
+        <w:t xml:space="preserve">S/ 27,000.00 + IGV</w:t>
       </w:r>
     </w:p>
     <w:p>
@@ -362,7 +418,7 @@
           <w:iCs/>
           <w:color w:val="000000" w:themeColor="text1"/>
         </w:rPr>
-        <w:t xml:space="preserve">US$ 15,867.65</w:t>
+        <w:t xml:space="preserve">S/ 27,000.00</w:t>
       </w:r>
     </w:p>
     <w:p>
@@ -394,7 +450,7 @@
           <w:iCs/>
           <w:color w:val="000000" w:themeColor="text1"/>
         </w:rPr>
-        <w:t xml:space="preserve">US$ 2,856.18</w:t>
+        <w:t xml:space="preserve">S/ 4,860.00</w:t>
       </w:r>
     </w:p>
     <w:p>
@@ -426,7 +482,7 @@
           <w:iCs/>
           <w:color w:val="000000" w:themeColor="text1"/>
         </w:rPr>
-        <w:t xml:space="preserve">US$ 18,723.83</w:t>
+        <w:t xml:space="preserve">S/ 31,860.00</w:t>
       </w:r>
     </w:p>
     <w:p>

</xml_diff>